<commit_message>
Podcasts : épisode 03 en ligne avec ses corrections à l'écoute ; Omnibus précisé (seuils CSRD, pas de nomination du CAC)
Co-Authored-By: Claude Opus 5.5 <noreply@anthropic.com>
Claude-Session: https://claude.ai/code/session_01VGqaqQeXmsuZhMfAg3Avq5
</commit_message>
<xml_diff>
--- a/podcasts/word/Podcasts-1-episodes-01-02-03.docx
+++ b/podcasts/word/Podcasts-1-episodes-01-02-03.docx
@@ -6911,7 +6911,7 @@
           <w:sz w:val="17"/>
           <w:szCs w:val="17"/>
         </w:rPr>
-        <w:t xml:space="preserve">- **Transposition de la directive Omnibus I** (2026/470) : texte français et nouveaux seuils, attendus au plus tard le 19 mars 2027.</w:t>
+        <w:t xml:space="preserve">- **Transposition de la directive Omnibus I** (2026/470) : texte français et nouveaux seuils d'application de la CSRD (sans effet sur les seuils de nomination d'un CAC), attendus au plus tard le 19 mars 2027.</w:t>
       </w:r>
     </w:p>
     <w:p>
@@ -14592,7 +14592,7 @@
           <w:sz w:val="17"/>
           <w:szCs w:val="17"/>
         </w:rPr>
-        <w:t xml:space="preserve">- **Transposition de la directive Omnibus I** (2026/470) : texte français et nouveaux seuils, attendus au plus tard le 19 mars 2027.</w:t>
+        <w:t xml:space="preserve">- **Transposition de la directive Omnibus I** (2026/470) : texte français et nouveaux seuils d'application de la CSRD (sans effet sur les seuils de nomination d'un CAC), attendus au plus tard le 19 mars 2027.</w:t>
       </w:r>
     </w:p>
     <w:p>
@@ -19959,7 +19959,7 @@
           <w:sz w:val="17"/>
           <w:szCs w:val="17"/>
         </w:rPr>
-        <w:t xml:space="preserve">- **Transposition de la directive Omnibus I** (2026/470) : texte français et nouveaux seuils, attendus au plus tard le 19 mars 2027.</w:t>
+        <w:t xml:space="preserve">- **Transposition de la directive Omnibus I** (2026/470) : texte français et nouveaux seuils d'application de la CSRD (sans effet sur les seuils de nomination d'un CAC), attendus au plus tard le 19 mars 2027.</w:t>
       </w:r>
     </w:p>
     <w:p>

</xml_diff>